<commit_message>
docs: Add LaTeX (.tex), BibTeX (.bib) with clickable DOI citations, and high-fidelity PDF; update student SAP ID to 60018230100 and DJSCE college name
</commit_message>
<xml_diff>
--- a/00_Academic_Deliverables/IPD_Tutorial_1_Varun_Gupta_55_Version_1.docx
+++ b/00_Academic_Deliverables/IPD_Tutorial_1_Varun_Gupta_55_Version_1.docx
@@ -112,7 +112,7 @@
               <w:rPr>
                 <w:sz w:val="20"/>
               </w:rPr>
-              <w:t>60004220055 / UID: 2022300055</w:t>
+              <w:t>60018230100</w:t>
             </w:r>
           </w:p>
         </w:tc>
@@ -236,7 +236,7 @@
               <w:rPr>
                 <w:sz w:val="20"/>
               </w:rPr>
-              <w:t>SVKM's NMIMS, Mukesh Patel School of Technology Management &amp; Engineering (MPSTME)</w:t>
+              <w:t>SVKM's Dwarkadas J. Sanghvi College of Engineering (DJSCE), Mumbai</w:t>
             </w:r>
           </w:p>
         </w:tc>

</xml_diff>